<commit_message>
style: reduce heading sizes and weight site-wide
Co-authored-by: Cursor <cursoragent@cursor.com>
</commit_message>
<xml_diff>
--- a/Qoutation_chilmund.docx
+++ b/Qoutation_chilmund.docx
@@ -6548,7 +6548,25 @@
                 <w:lang w:eastAsia="en-ZW"/>
                 <w14:ligatures w14:val="none"/>
               </w:rPr>
-              <w:t>1,215</w:t>
+              <w:t>1,</w:t>
+            </w:r>
+            <w:r>
+              <w:rPr>
+                <w:rFonts w:ascii="Aptos Display" w:eastAsia="Times New Roman" w:hAnsi="Aptos Display" w:cs="Times New Roman"/>
+                <w:kern w:val="0"/>
+                <w:lang w:eastAsia="en-ZW"/>
+                <w14:ligatures w14:val="none"/>
+              </w:rPr>
+              <w:t>5</w:t>
+            </w:r>
+            <w:r>
+              <w:rPr>
+                <w:rFonts w:ascii="Aptos Display" w:eastAsia="Times New Roman" w:hAnsi="Aptos Display" w:cs="Times New Roman"/>
+                <w:kern w:val="0"/>
+                <w:lang w:eastAsia="en-ZW"/>
+                <w14:ligatures w14:val="none"/>
+              </w:rPr>
+              <w:t>15</w:t>
             </w:r>
           </w:p>
         </w:tc>

</xml_diff>